<commit_message>
Confirm uploaded file in progress
</commit_message>
<xml_diff>
--- a/Todo.docx
+++ b/Todo.docx
@@ -491,6 +491,95 @@
         <w:t>secondary</w:t>
       </w:r>
       <w:proofErr w:type="spellEnd"/>
+    </w:p>
+    <w:p>
+      <w:pPr>
+        <w:rPr>
+          <w:sz w:val="24"/>
+          <w:szCs w:val="24"/>
+          <w:lang w:val="fr-FR"/>
+        </w:rPr>
+      </w:pPr>
+      <w:r>
+        <w:rPr>
+          <w:sz w:val="24"/>
+          <w:szCs w:val="24"/>
+          <w:lang w:val="fr-FR"/>
+        </w:rPr>
+        <w:t xml:space="preserve">2 – Check if the </w:t>
+      </w:r>
+      <w:proofErr w:type="spellStart"/>
+      <w:r>
+        <w:rPr>
+          <w:sz w:val="24"/>
+          <w:szCs w:val="24"/>
+          <w:lang w:val="fr-FR"/>
+        </w:rPr>
+        <w:t>column</w:t>
+      </w:r>
+      <w:proofErr w:type="spellEnd"/>
+      <w:r>
+        <w:rPr>
+          <w:sz w:val="24"/>
+          <w:szCs w:val="24"/>
+          <w:lang w:val="fr-FR"/>
+        </w:rPr>
+        <w:t xml:space="preserve"> </w:t>
+      </w:r>
+      <w:proofErr w:type="spellStart"/>
+      <w:r>
+        <w:rPr>
+          <w:sz w:val="24"/>
+          <w:szCs w:val="24"/>
+          <w:lang w:val="fr-FR"/>
+        </w:rPr>
+        <w:t>is</w:t>
+      </w:r>
+      <w:proofErr w:type="spellEnd"/>
+      <w:r>
+        <w:rPr>
+          <w:sz w:val="24"/>
+          <w:szCs w:val="24"/>
+          <w:lang w:val="fr-FR"/>
+        </w:rPr>
+        <w:t xml:space="preserve"> type DATE (</w:t>
+      </w:r>
+      <w:proofErr w:type="spellStart"/>
+      <w:r>
+        <w:rPr>
+          <w:sz w:val="24"/>
+          <w:szCs w:val="24"/>
+          <w:lang w:val="fr-FR"/>
+        </w:rPr>
+        <w:t>stored</w:t>
+      </w:r>
+      <w:proofErr w:type="spellEnd"/>
+      <w:r>
+        <w:rPr>
+          <w:sz w:val="24"/>
+          <w:szCs w:val="24"/>
+          <w:lang w:val="fr-FR"/>
+        </w:rPr>
+        <w:t xml:space="preserve"> </w:t>
+      </w:r>
+      <w:proofErr w:type="spellStart"/>
+      <w:r>
+        <w:rPr>
+          <w:sz w:val="24"/>
+          <w:szCs w:val="24"/>
+          <w:lang w:val="fr-FR"/>
+        </w:rPr>
+        <w:t>procedure</w:t>
+      </w:r>
+      <w:proofErr w:type="spellEnd"/>
+      <w:r>
+        <w:rPr>
+          <w:sz w:val="24"/>
+          <w:szCs w:val="24"/>
+          <w:lang w:val="fr-FR"/>
+        </w:rPr>
+        <w:t>)</w:t>
+      </w:r>
     </w:p>
     <w:p>
       <w:pPr>

</xml_diff>